<commit_message>
移除 Ogedengbe et al. (2022) 引用
使用者決定整筆移除此引用——查證完整作者名單時發現出版年份存在
2022／2025 出處衝突（同標題疑似被不同期刊網站轉載），且該文獻本身
已被文獻矩陣標記為品質疑慮較高之產業綜述，在無法確認正確出版年份
的情況下不宜勉強補齊 APA7 要求之完整作者列表。

已移除正文兩處引用：

1. 02-recommendation-fintech-digital-brokerage.md「1. 研究主題
   演進」段落：原與 Shah et al.（2022）並列討論兩篇「品質有限」
   文獻，已改為僅討論 Shah et al.（2022），移除 Ogedengbe 部分。

2. 同檔案「2. 常見推薦方法或模型」段落：原以 Ogedengbe et al.
   （2022）之分類作為「混合式推薦三分類」（模型層融合／分數層
   融合／切換機制）之引用依據，已改寫為不掛名之常見分類敘述——
   此三分類本屬混合推薦系統之標準通用分類，內容保留，僅移除
   引用歸屬。

references-draft.md 移除對應正式引用文獻條目與已知待補事項之
過時陳述，改為記錄本次移除決定與理由；references-final.md 移除
對應西文文獻條目。

已重新執行完整轉檔流程驗證輸出正常（542 段落、6 個表格、2 張圖片、
頁面尺寸 A4、水平線 0 條、明確分頁符號 7 處、PAGEREF 欄位 8 個，
全文無 Ogedengbe 殘留）。

Co-Authored-By: Claude Sonnet 5 <noreply@anthropic.com>
</commit_message>
<xml_diff>
--- a/thesis-investor-segmentation/thesis/exports/黃子甄_論文計畫書(第一至三章初稿).docx
+++ b/thesis-investor-segmentation/thesis/exports/黃子甄_論文計畫書(第一至三章初稿).docx
@@ -8915,25 +8915,7 @@
         <w:rPr>
           <w:rFonts w:hint="eastAsia"/>
         </w:rPr>
-        <w:t xml:space="preserve">al.（2022）與</w:t>
-      </w:r>
-      <w:r>
-        <w:t xml:space="preserve"> Ogedengbe et </w:t>
-      </w:r>
-      <w:r>
-        <w:rPr>
-          <w:rFonts w:hint="eastAsia"/>
-        </w:rPr>
-        <w:t xml:space="preserve">al.（2022）兩篇文獻雖與基金推薦相關，但性質上有所限制：Shah</w:t>
-      </w:r>
-      <w:r>
-        <w:t xml:space="preserve"> et </w:t>
-      </w:r>
-      <w:r>
-        <w:rPr>
-          <w:rFonts w:hint="eastAsia"/>
-        </w:rPr>
-        <w:t xml:space="preserve">al.（2022）為印度大學部學生的「提案型」論文，僅提出知識圖譜嵌入結合深度學習的推薦架構設計，</w:t>
+        <w:t xml:space="preserve">al.（2022）雖與基金推薦相關，但性質上有所限制：其為印度大學部學生的「提案型」論文，僅提出知識圖譜嵌入結合深度學習的推薦架構設計，</w:t>
       </w:r>
       <w:r>
         <w:rPr>
@@ -8974,43 +8956,7 @@
         <w:rPr>
           <w:rFonts w:hint="eastAsia"/>
         </w:rPr>
-        <w:t xml:space="preserve">al.（2022）本身的方法設計並未經實證驗證；Ogedengbe</w:t>
-      </w:r>
-      <w:r>
-        <w:t xml:space="preserve"> et </w:t>
-      </w:r>
-      <w:r>
-        <w:rPr>
-          <w:rFonts w:hint="eastAsia"/>
-        </w:rPr>
-        <w:t xml:space="preserve">al.（2022）則是一篇品質疑慮較高的產業綜述，其</w:t>
-      </w:r>
-      <w:r>
-        <w:t xml:space="preserve"> 79 </w:t>
-      </w:r>
-      <w:r>
-        <w:rPr>
-          <w:rFonts w:hint="eastAsia"/>
-        </w:rPr>
-        <w:t xml:space="preserve">篇參考文獻中大量與主題無關（如疫苗物流、交通號誌辨識），且全文無原創實驗，所有產業案例（Revolut、Robinhood</w:t>
-      </w:r>
-      <w:r>
-        <w:t xml:space="preserve"> </w:t>
-      </w:r>
-      <w:r>
-        <w:rPr>
-          <w:rFonts w:hint="eastAsia"/>
-        </w:rPr>
-        <w:t xml:space="preserve">等）均為公開報導的二手轉述，故僅適合作為「FinTech</w:t>
-      </w:r>
-      <w:r>
-        <w:t xml:space="preserve"> </w:t>
-      </w:r>
-      <w:r>
-        <w:rPr>
-          <w:rFonts w:hint="eastAsia"/>
-        </w:rPr>
-        <w:t xml:space="preserve">使用者行為三分類」（交易、瀏覽、投資組合活動）與「混合推薦架構融合方式」等概念性背景參考，不宜作為方法論或實證的核心支撐。Sanz-Cruzado,</w:t>
+        <w:t xml:space="preserve">al.（2022）本身的方法設計並未經實證驗證。Sanz-Cruzado,</w:t>
       </w:r>
       <w:r>
         <w:t xml:space="preserve"> Droukas &amp; </w:t>
@@ -9091,16 +9037,7 @@
         <w:rPr>
           <w:rFonts w:hint="eastAsia"/>
         </w:rPr>
-        <w:t xml:space="preserve">基金／金融商品推薦常見模型可分為五類。第一，協同過濾模型：以使用者歷史購買、贖回或評分資料建立使用者—基金互動矩陣。第二，內容式推薦：依基金屬性進行匹配，包括基金類型、風險等級、投資區域、費用率等。第三，混合式推薦：Ogedengbe</w:t>
-      </w:r>
-      <w:r>
-        <w:t xml:space="preserve"> et </w:t>
-      </w:r>
-      <w:r>
-        <w:rPr>
-          <w:rFonts w:hint="eastAsia"/>
-        </w:rPr>
-        <w:t xml:space="preserve">al.（2022）將混合架構的融合方式歸納為模型層融合（CF/CBF</w:t>
+        <w:t xml:space="preserve">基金／金融商品推薦常見模型可分為五類。第一，協同過濾模型：以使用者歷史購買、贖回或評分資料建立使用者—基金互動矩陣。第二，內容式推薦：依基金屬性進行匹配，包括基金類型、風險等級、投資區域、費用率等。第三，混合式推薦：依常見分類可分為模型層融合（CF/CBF</w:t>
       </w:r>
       <w:r>
         <w:t xml:space="preserve"> </w:t>
@@ -9118,7 +9055,7 @@
         <w:rPr>
           <w:rFonts w:hint="eastAsia"/>
         </w:rPr>
-        <w:t xml:space="preserve">CF」定位為切換機制變形的分類依據（惟該文獻本身品質有限，僅作分類概念引用）。第四，圖模型與深度協同過濾：Chou,</w:t>
+        <w:t xml:space="preserve">CF」定位為切換機制變形之分類依據。第四，圖模型與深度協同過濾：Chou,</w:t>
       </w:r>
       <w:r>
         <w:t xml:space="preserve"> Chen &amp; </w:t>
@@ -34968,40 +34905,6 @@
         <w:pStyle w:val="References"/>
       </w:pPr>
       <w:r>
-        <w:t xml:space="preserve">Ogedengbe, A. O., et al. (2022). A hybrid recommendation engine for fintech platforms: Leveraging behavioral analytics for user engagement and conversion.</w:t>
-      </w:r>
-      <w:r>
-        <w:t xml:space="preserve"> </w:t>
-      </w:r>
-      <w:r>
-        <w:rPr>
-          <w:i/>
-          <w:iCs/>
-        </w:rPr>
-        <w:t xml:space="preserve">International Journal of Multidisciplinary Evolutionary Research</w:t>
-      </w:r>
-      <w:r>
-        <w:t xml:space="preserve">,</w:t>
-      </w:r>
-      <w:r>
-        <w:t xml:space="preserve"> </w:t>
-      </w:r>
-      <w:r>
-        <w:rPr>
-          <w:i/>
-          <w:iCs/>
-        </w:rPr>
-        <w:t xml:space="preserve">3</w:t>
-      </w:r>
-      <w:r>
-        <w:t xml:space="preserve">(1).</w:t>
-      </w:r>
-    </w:p>
-    <w:p>
-      <w:pPr>
-        <w:pStyle w:val="References"/>
-      </w:pPr>
-      <w:r>
         <w:t xml:space="preserve">Rousseeuw, P. J. (1987). Silhouettes: A graphical aid to the interpretation and validation of cluster analysis.</w:t>
       </w:r>
       <w:r>

</xml_diff>